<commit_message>
Update Device Repair Checklist
</commit_message>
<xml_diff>
--- a/content/Device Repair Checklist.docx
+++ b/content/Device Repair Checklist.docx
@@ -847,7 +847,21 @@
                 <w:i/>
                 <w:iCs/>
               </w:rPr>
-              <w:t>Do all built-in camera (i.e. webcam) work?</w:t>
+              <w:t>Do all built-in camera</w:t>
+            </w:r>
+            <w:r>
+              <w:rPr>
+                <w:i/>
+                <w:iCs/>
+              </w:rPr>
+              <w:t>s</w:t>
+            </w:r>
+            <w:r>
+              <w:rPr>
+                <w:i/>
+                <w:iCs/>
+              </w:rPr>
+              <w:t xml:space="preserve"> (i.e. webcam) work?</w:t>
             </w:r>
           </w:p>
         </w:tc>

</xml_diff>